<commit_message>
refactor: dynamic no rek
</commit_message>
<xml_diff>
--- a/templates/template_invoices_2.docx
+++ b/templates/template_invoices_2.docx
@@ -52,21 +52,67 @@
           <w:szCs w:val="24"/>
         </w:rPr>
       </w:pPr>
-      <w:r>
-        <w:rPr>
-          <w:rFonts w:ascii="Times New Roman" w:eastAsia="Times New Roman" w:hAnsi="Times New Roman" w:cs="Times New Roman"/>
-          <w:sz w:val="24"/>
-          <w:szCs w:val="24"/>
-        </w:rPr>
-        <w:t xml:space="preserve">Nomor Kuitansi: </w:t>
-      </w:r>
-      <w:r>
-        <w:rPr>
-          <w:rFonts w:ascii="Times New Roman" w:eastAsia="Times New Roman" w:hAnsi="Times New Roman" w:cs="Times New Roman"/>
-          <w:sz w:val="24"/>
-          <w:szCs w:val="24"/>
-        </w:rPr>
-        <w:t>{kwitansi_number}</w:t>
+      <w:proofErr w:type="spellStart"/>
+      <w:r>
+        <w:rPr>
+          <w:rFonts w:ascii="Times New Roman" w:eastAsia="Times New Roman" w:hAnsi="Times New Roman" w:cs="Times New Roman"/>
+          <w:sz w:val="24"/>
+          <w:szCs w:val="24"/>
+        </w:rPr>
+        <w:t>Nomor</w:t>
+      </w:r>
+      <w:proofErr w:type="spellEnd"/>
+      <w:r>
+        <w:rPr>
+          <w:rFonts w:ascii="Times New Roman" w:eastAsia="Times New Roman" w:hAnsi="Times New Roman" w:cs="Times New Roman"/>
+          <w:sz w:val="24"/>
+          <w:szCs w:val="24"/>
+        </w:rPr>
+        <w:t xml:space="preserve"> </w:t>
+      </w:r>
+      <w:proofErr w:type="spellStart"/>
+      <w:r>
+        <w:rPr>
+          <w:rFonts w:ascii="Times New Roman" w:eastAsia="Times New Roman" w:hAnsi="Times New Roman" w:cs="Times New Roman"/>
+          <w:sz w:val="24"/>
+          <w:szCs w:val="24"/>
+        </w:rPr>
+        <w:t>Kuitansi</w:t>
+      </w:r>
+      <w:proofErr w:type="spellEnd"/>
+      <w:r>
+        <w:rPr>
+          <w:rFonts w:ascii="Times New Roman" w:eastAsia="Times New Roman" w:hAnsi="Times New Roman" w:cs="Times New Roman"/>
+          <w:sz w:val="24"/>
+          <w:szCs w:val="24"/>
+        </w:rPr>
+        <w:t xml:space="preserve">: </w:t>
+      </w:r>
+      <w:r>
+        <w:rPr>
+          <w:rFonts w:ascii="Times New Roman" w:eastAsia="Times New Roman" w:hAnsi="Times New Roman" w:cs="Times New Roman"/>
+          <w:sz w:val="24"/>
+          <w:szCs w:val="24"/>
+        </w:rPr>
+        <w:t>{</w:t>
+      </w:r>
+      <w:proofErr w:type="spellStart"/>
+      <w:r>
+        <w:rPr>
+          <w:rFonts w:ascii="Times New Roman" w:eastAsia="Times New Roman" w:hAnsi="Times New Roman" w:cs="Times New Roman"/>
+          <w:sz w:val="24"/>
+          <w:szCs w:val="24"/>
+        </w:rPr>
+        <w:t>kwitansi_number</w:t>
+      </w:r>
+      <w:proofErr w:type="spellEnd"/>
+      <w:r>
+        <w:rPr>
+          <w:rFonts w:ascii="Times New Roman" w:eastAsia="Times New Roman" w:hAnsi="Times New Roman" w:cs="Times New Roman"/>
+          <w:sz w:val="24"/>
+          <w:szCs w:val="24"/>
+        </w:rPr>
+        <w:t>}</w:t>
       </w:r>
     </w:p>
     <w:p>
@@ -102,8 +148,54 @@
           <w:sz w:val="24"/>
           <w:szCs w:val="24"/>
         </w:rPr>
-        <w:t xml:space="preserve">  Sudah terima dari</w:t>
-      </w:r>
+        <w:t xml:space="preserve">  </w:t>
+      </w:r>
+      <w:proofErr w:type="spellStart"/>
+      <w:r>
+        <w:rPr>
+          <w:rFonts w:ascii="Times New Roman" w:eastAsia="Times New Roman" w:hAnsi="Times New Roman" w:cs="Times New Roman"/>
+          <w:sz w:val="24"/>
+          <w:szCs w:val="24"/>
+        </w:rPr>
+        <w:t>Sudah</w:t>
+      </w:r>
+      <w:proofErr w:type="spellEnd"/>
+      <w:r>
+        <w:rPr>
+          <w:rFonts w:ascii="Times New Roman" w:eastAsia="Times New Roman" w:hAnsi="Times New Roman" w:cs="Times New Roman"/>
+          <w:sz w:val="24"/>
+          <w:szCs w:val="24"/>
+        </w:rPr>
+        <w:t xml:space="preserve"> </w:t>
+      </w:r>
+      <w:proofErr w:type="spellStart"/>
+      <w:r>
+        <w:rPr>
+          <w:rFonts w:ascii="Times New Roman" w:eastAsia="Times New Roman" w:hAnsi="Times New Roman" w:cs="Times New Roman"/>
+          <w:sz w:val="24"/>
+          <w:szCs w:val="24"/>
+        </w:rPr>
+        <w:t>terima</w:t>
+      </w:r>
+      <w:proofErr w:type="spellEnd"/>
+      <w:r>
+        <w:rPr>
+          <w:rFonts w:ascii="Times New Roman" w:eastAsia="Times New Roman" w:hAnsi="Times New Roman" w:cs="Times New Roman"/>
+          <w:sz w:val="24"/>
+          <w:szCs w:val="24"/>
+        </w:rPr>
+        <w:t xml:space="preserve"> </w:t>
+      </w:r>
+      <w:proofErr w:type="spellStart"/>
+      <w:r>
+        <w:rPr>
+          <w:rFonts w:ascii="Times New Roman" w:eastAsia="Times New Roman" w:hAnsi="Times New Roman" w:cs="Times New Roman"/>
+          <w:sz w:val="24"/>
+          <w:szCs w:val="24"/>
+        </w:rPr>
+        <w:t>dari</w:t>
+      </w:r>
+      <w:proofErr w:type="spellEnd"/>
       <w:r>
         <w:rPr>
           <w:rFonts w:ascii="Times New Roman" w:eastAsia="Times New Roman" w:hAnsi="Times New Roman" w:cs="Times New Roman"/>
@@ -148,7 +240,25 @@
           <w:sz w:val="24"/>
           <w:szCs w:val="24"/>
         </w:rPr>
-        <w:t xml:space="preserve">  Jumlah Uang</w:t>
+        <w:t xml:space="preserve">  </w:t>
+      </w:r>
+      <w:proofErr w:type="spellStart"/>
+      <w:r>
+        <w:rPr>
+          <w:rFonts w:ascii="Times New Roman" w:eastAsia="Times New Roman" w:hAnsi="Times New Roman" w:cs="Times New Roman"/>
+          <w:sz w:val="24"/>
+          <w:szCs w:val="24"/>
+        </w:rPr>
+        <w:t>Jumlah</w:t>
+      </w:r>
+      <w:proofErr w:type="spellEnd"/>
+      <w:r>
+        <w:rPr>
+          <w:rFonts w:ascii="Times New Roman" w:eastAsia="Times New Roman" w:hAnsi="Times New Roman" w:cs="Times New Roman"/>
+          <w:sz w:val="24"/>
+          <w:szCs w:val="24"/>
+        </w:rPr>
+        <w:t xml:space="preserve"> Uang</w:t>
       </w:r>
       <w:r>
         <w:rPr>
@@ -165,7 +275,25 @@
           <w:sz w:val="24"/>
           <w:szCs w:val="24"/>
         </w:rPr>
-        <w:t>{price_total}</w:t>
+        <w:t>{</w:t>
+      </w:r>
+      <w:proofErr w:type="spellStart"/>
+      <w:r>
+        <w:rPr>
+          <w:rFonts w:ascii="Times New Roman" w:eastAsia="Times New Roman" w:hAnsi="Times New Roman" w:cs="Times New Roman"/>
+          <w:sz w:val="24"/>
+          <w:szCs w:val="24"/>
+        </w:rPr>
+        <w:t>price_total</w:t>
+      </w:r>
+      <w:proofErr w:type="spellEnd"/>
+      <w:r>
+        <w:rPr>
+          <w:rFonts w:ascii="Times New Roman" w:eastAsia="Times New Roman" w:hAnsi="Times New Roman" w:cs="Times New Roman"/>
+          <w:sz w:val="24"/>
+          <w:szCs w:val="24"/>
+        </w:rPr>
+        <w:t>}</w:t>
       </w:r>
       <w:r>
         <w:rPr>
@@ -196,8 +324,18 @@
           <w:sz w:val="24"/>
           <w:szCs w:val="24"/>
         </w:rPr>
-        <w:t xml:space="preserve">  Terbilang</w:t>
-      </w:r>
+        <w:t xml:space="preserve">  </w:t>
+      </w:r>
+      <w:proofErr w:type="spellStart"/>
+      <w:r>
+        <w:rPr>
+          <w:rFonts w:ascii="Times New Roman" w:eastAsia="Times New Roman" w:hAnsi="Times New Roman" w:cs="Times New Roman"/>
+          <w:sz w:val="24"/>
+          <w:szCs w:val="24"/>
+        </w:rPr>
+        <w:t>Terbilang</w:t>
+      </w:r>
+      <w:proofErr w:type="spellEnd"/>
       <w:r>
         <w:rPr>
           <w:rFonts w:ascii="Times New Roman" w:eastAsia="Times New Roman" w:hAnsi="Times New Roman" w:cs="Times New Roman"/>
@@ -213,7 +351,25 @@
           <w:sz w:val="24"/>
           <w:szCs w:val="24"/>
         </w:rPr>
-        <w:t>{terbilang}</w:t>
+        <w:t>{</w:t>
+      </w:r>
+      <w:proofErr w:type="spellStart"/>
+      <w:r>
+        <w:rPr>
+          <w:rFonts w:ascii="Times New Roman" w:eastAsia="Times New Roman" w:hAnsi="Times New Roman" w:cs="Times New Roman"/>
+          <w:sz w:val="24"/>
+          <w:szCs w:val="24"/>
+        </w:rPr>
+        <w:t>terbilang</w:t>
+      </w:r>
+      <w:proofErr w:type="spellEnd"/>
+      <w:r>
+        <w:rPr>
+          <w:rFonts w:ascii="Times New Roman" w:eastAsia="Times New Roman" w:hAnsi="Times New Roman" w:cs="Times New Roman"/>
+          <w:sz w:val="24"/>
+          <w:szCs w:val="24"/>
+        </w:rPr>
+        <w:t>}</w:t>
       </w:r>
     </w:p>
     <w:p>
@@ -236,8 +392,36 @@
           <w:sz w:val="24"/>
           <w:szCs w:val="24"/>
         </w:rPr>
-        <w:t xml:space="preserve"> Untuk Pembayaran</w:t>
-      </w:r>
+        <w:t xml:space="preserve"> </w:t>
+      </w:r>
+      <w:proofErr w:type="spellStart"/>
+      <w:r>
+        <w:rPr>
+          <w:rFonts w:ascii="Times New Roman" w:eastAsia="Times New Roman" w:hAnsi="Times New Roman" w:cs="Times New Roman"/>
+          <w:sz w:val="24"/>
+          <w:szCs w:val="24"/>
+        </w:rPr>
+        <w:t>Untuk</w:t>
+      </w:r>
+      <w:proofErr w:type="spellEnd"/>
+      <w:r>
+        <w:rPr>
+          <w:rFonts w:ascii="Times New Roman" w:eastAsia="Times New Roman" w:hAnsi="Times New Roman" w:cs="Times New Roman"/>
+          <w:sz w:val="24"/>
+          <w:szCs w:val="24"/>
+        </w:rPr>
+        <w:t xml:space="preserve"> </w:t>
+      </w:r>
+      <w:proofErr w:type="spellStart"/>
+      <w:r>
+        <w:rPr>
+          <w:rFonts w:ascii="Times New Roman" w:eastAsia="Times New Roman" w:hAnsi="Times New Roman" w:cs="Times New Roman"/>
+          <w:sz w:val="24"/>
+          <w:szCs w:val="24"/>
+        </w:rPr>
+        <w:t>Pembayaran</w:t>
+      </w:r>
+      <w:proofErr w:type="spellEnd"/>
       <w:r>
         <w:rPr>
           <w:rFonts w:ascii="Times New Roman" w:eastAsia="Times New Roman" w:hAnsi="Times New Roman" w:cs="Times New Roman"/>
@@ -470,8 +654,35 @@
           <w:szCs w:val="24"/>
         </w:rPr>
         <w:tab/>
-        <w:t>Wahyuni Puspitasari</w:t>
-      </w:r>
+      </w:r>
+      <w:proofErr w:type="spellStart"/>
+      <w:r>
+        <w:rPr>
+          <w:rFonts w:ascii="Times New Roman" w:eastAsia="Times New Roman" w:hAnsi="Times New Roman" w:cs="Times New Roman"/>
+          <w:sz w:val="24"/>
+          <w:szCs w:val="24"/>
+        </w:rPr>
+        <w:t>Wahyuni</w:t>
+      </w:r>
+      <w:proofErr w:type="spellEnd"/>
+      <w:r>
+        <w:rPr>
+          <w:rFonts w:ascii="Times New Roman" w:eastAsia="Times New Roman" w:hAnsi="Times New Roman" w:cs="Times New Roman"/>
+          <w:sz w:val="24"/>
+          <w:szCs w:val="24"/>
+        </w:rPr>
+        <w:t xml:space="preserve"> </w:t>
+      </w:r>
+      <w:proofErr w:type="spellStart"/>
+      <w:r>
+        <w:rPr>
+          <w:rFonts w:ascii="Times New Roman" w:eastAsia="Times New Roman" w:hAnsi="Times New Roman" w:cs="Times New Roman"/>
+          <w:sz w:val="24"/>
+          <w:szCs w:val="24"/>
+        </w:rPr>
+        <w:t>Puspitasari</w:t>
+      </w:r>
+      <w:proofErr w:type="spellEnd"/>
     </w:p>
     <w:p>
       <w:pPr>
@@ -658,6 +869,7 @@
           <w:szCs w:val="28"/>
         </w:rPr>
       </w:pPr>
+      <w:proofErr w:type="spellStart"/>
       <w:r>
         <w:rPr>
           <w:rFonts w:ascii="Times New Roman" w:hAnsi="Times New Roman" w:cs="Times New Roman"/>
@@ -666,6 +878,7 @@
         </w:rPr>
         <w:t>Tanggal</w:t>
       </w:r>
+      <w:proofErr w:type="spellEnd"/>
       <w:r>
         <w:rPr>
           <w:rFonts w:ascii="Times New Roman" w:hAnsi="Times New Roman" w:cs="Times New Roman"/>
@@ -682,7 +895,27 @@
           <w:sz w:val="28"/>
           <w:lang w:val="en-US"/>
         </w:rPr>
-        <w:t>{invoice_date}</w:t>
+        <w:t>{</w:t>
+      </w:r>
+      <w:proofErr w:type="spellStart"/>
+      <w:r>
+        <w:rPr>
+          <w:rFonts w:ascii="Times New Roman" w:hAnsi="Times New Roman" w:cs="Times New Roman"/>
+          <w:b/>
+          <w:sz w:val="28"/>
+          <w:lang w:val="en-US"/>
+        </w:rPr>
+        <w:t>invoice_date</w:t>
+      </w:r>
+      <w:proofErr w:type="spellEnd"/>
+      <w:r>
+        <w:rPr>
+          <w:rFonts w:ascii="Times New Roman" w:hAnsi="Times New Roman" w:cs="Times New Roman"/>
+          <w:b/>
+          <w:sz w:val="28"/>
+          <w:lang w:val="en-US"/>
+        </w:rPr>
+        <w:t>}</w:t>
       </w:r>
     </w:p>
     <w:p>
@@ -972,7 +1205,25 @@
                 <w:sz w:val="24"/>
                 <w:lang w:val="en-US"/>
               </w:rPr>
-              <w:t>{price_unit}</w:t>
+              <w:t>{</w:t>
+            </w:r>
+            <w:proofErr w:type="spellStart"/>
+            <w:r>
+              <w:rPr>
+                <w:spacing w:val="-2"/>
+                <w:sz w:val="24"/>
+                <w:lang w:val="en-US"/>
+              </w:rPr>
+              <w:t>price_unit</w:t>
+            </w:r>
+            <w:proofErr w:type="spellEnd"/>
+            <w:r>
+              <w:rPr>
+                <w:spacing w:val="-2"/>
+                <w:sz w:val="24"/>
+                <w:lang w:val="en-US"/>
+              </w:rPr>
+              <w:t>}</w:t>
             </w:r>
           </w:p>
         </w:tc>
@@ -1049,7 +1300,25 @@
                 <w:sz w:val="24"/>
                 <w:lang w:val="en-US"/>
               </w:rPr>
-              <w:t>{price_subtotal}</w:t>
+              <w:t>{</w:t>
+            </w:r>
+            <w:proofErr w:type="spellStart"/>
+            <w:r>
+              <w:rPr>
+                <w:spacing w:val="-2"/>
+                <w:sz w:val="24"/>
+                <w:lang w:val="en-US"/>
+              </w:rPr>
+              <w:t>price_subtotal</w:t>
+            </w:r>
+            <w:proofErr w:type="spellEnd"/>
+            <w:r>
+              <w:rPr>
+                <w:spacing w:val="-2"/>
+                <w:sz w:val="24"/>
+                <w:lang w:val="en-US"/>
+              </w:rPr>
+              <w:t>}</w:t>
             </w:r>
           </w:p>
         </w:tc>
@@ -1188,7 +1457,25 @@
                 <w:sz w:val="24"/>
                 <w:lang w:val="en-US"/>
               </w:rPr>
-              <w:t>{amount_untaxed}</w:t>
+              <w:t>{</w:t>
+            </w:r>
+            <w:proofErr w:type="spellStart"/>
+            <w:r>
+              <w:rPr>
+                <w:spacing w:val="-2"/>
+                <w:sz w:val="24"/>
+                <w:lang w:val="en-US"/>
+              </w:rPr>
+              <w:t>amount_untaxed</w:t>
+            </w:r>
+            <w:proofErr w:type="spellEnd"/>
+            <w:r>
+              <w:rPr>
+                <w:spacing w:val="-2"/>
+                <w:sz w:val="24"/>
+                <w:lang w:val="en-US"/>
+              </w:rPr>
+              <w:t>}</w:t>
             </w:r>
           </w:p>
         </w:tc>
@@ -1475,7 +1762,25 @@
                 <w:sz w:val="24"/>
                 <w:lang w:val="en-US"/>
               </w:rPr>
-              <w:t>{tax_pph}</w:t>
+              <w:t>{</w:t>
+            </w:r>
+            <w:proofErr w:type="spellStart"/>
+            <w:r>
+              <w:rPr>
+                <w:spacing w:val="-2"/>
+                <w:sz w:val="24"/>
+                <w:lang w:val="en-US"/>
+              </w:rPr>
+              <w:t>tax_pph</w:t>
+            </w:r>
+            <w:proofErr w:type="spellEnd"/>
+            <w:r>
+              <w:rPr>
+                <w:spacing w:val="-2"/>
+                <w:sz w:val="24"/>
+                <w:lang w:val="en-US"/>
+              </w:rPr>
+              <w:t>}</w:t>
             </w:r>
           </w:p>
         </w:tc>
@@ -1696,7 +2001,27 @@
                 <w:sz w:val="24"/>
                 <w:lang w:val="en-US"/>
               </w:rPr>
-              <w:t>{price_total}</w:t>
+              <w:t>{</w:t>
+            </w:r>
+            <w:proofErr w:type="spellStart"/>
+            <w:r>
+              <w:rPr>
+                <w:b/>
+                <w:spacing w:val="-2"/>
+                <w:sz w:val="24"/>
+                <w:lang w:val="en-US"/>
+              </w:rPr>
+              <w:t>price_total</w:t>
+            </w:r>
+            <w:proofErr w:type="spellEnd"/>
+            <w:r>
+              <w:rPr>
+                <w:b/>
+                <w:spacing w:val="-2"/>
+                <w:sz w:val="24"/>
+                <w:lang w:val="en-US"/>
+              </w:rPr>
+              <w:t>}</w:t>
             </w:r>
           </w:p>
         </w:tc>
@@ -1794,7 +2119,27 @@
       </w:r>
       <w:r>
         <w:tab/>
-        <w:t>: 130-00-2282285-5</w:t>
+        <w:t xml:space="preserve">: </w:t>
+      </w:r>
+      <w:r>
+        <w:rPr>
+          <w:lang w:val="en-US"/>
+        </w:rPr>
+        <w:t>{</w:t>
+      </w:r>
+      <w:proofErr w:type="spellStart"/>
+      <w:r>
+        <w:rPr>
+          <w:lang w:val="en-US"/>
+        </w:rPr>
+        <w:t>no_rek</w:t>
+      </w:r>
+      <w:proofErr w:type="spellEnd"/>
+      <w:r>
+        <w:rPr>
+          <w:lang w:val="en-US"/>
+        </w:rPr>
+        <w:t>}</w:t>
       </w:r>
     </w:p>
     <w:p>
@@ -1957,7 +2302,7 @@
         <v:shape id="_x0000_i1026" type="#_x0000_t75" style="width:453.75pt;height:7.5pt">
           <v:imagedata r:id="rId1" o:title=""/>
         </v:shape>
-        <o:OLEObject Type="Embed" ProgID="CorelDraw.Graphic.16" ShapeID="_x0000_i1026" DrawAspect="Content" ObjectID="_1833618569" r:id="rId2"/>
+        <o:OLEObject Type="Embed" ProgID="CorelDraw.Graphic.16" ShapeID="_x0000_i1026" DrawAspect="Content" ObjectID="_1834056102" r:id="rId2"/>
       </w:object>
     </w:r>
     <w:r>
@@ -1992,8 +2337,36 @@
         <w:sz w:val="20"/>
         <w:szCs w:val="20"/>
       </w:rPr>
-      <w:t>Jl. Jakarta No.24, Kebonwaru, Batununggal</w:t>
+      <w:t xml:space="preserve">Jl. Jakarta No.24, </w:t>
     </w:r>
+    <w:proofErr w:type="spellStart"/>
+    <w:r>
+      <w:rPr>
+        <w:rFonts w:ascii="Times New Roman" w:eastAsia="Times New Roman" w:hAnsi="Times New Roman" w:cs="Times New Roman"/>
+        <w:sz w:val="20"/>
+        <w:szCs w:val="20"/>
+      </w:rPr>
+      <w:t>Kebonwaru</w:t>
+    </w:r>
+    <w:proofErr w:type="spellEnd"/>
+    <w:r>
+      <w:rPr>
+        <w:rFonts w:ascii="Times New Roman" w:eastAsia="Times New Roman" w:hAnsi="Times New Roman" w:cs="Times New Roman"/>
+        <w:sz w:val="20"/>
+        <w:szCs w:val="20"/>
+      </w:rPr>
+      <w:t xml:space="preserve">, </w:t>
+    </w:r>
+    <w:proofErr w:type="spellStart"/>
+    <w:r>
+      <w:rPr>
+        <w:rFonts w:ascii="Times New Roman" w:eastAsia="Times New Roman" w:hAnsi="Times New Roman" w:cs="Times New Roman"/>
+        <w:sz w:val="20"/>
+        <w:szCs w:val="20"/>
+      </w:rPr>
+      <w:t>Batununggal</w:t>
+    </w:r>
+    <w:proofErr w:type="spellEnd"/>
   </w:p>
   <w:p>
     <w:pPr>
@@ -2208,7 +2581,7 @@
           <v:imagedata r:id="rId1" o:title=""/>
           <w10:wrap anchorx="margin"/>
         </v:shape>
-        <o:OLEObject Type="Embed" ProgID="CorelDraw.Graphic.16" ShapeID="_x0000_s2051" DrawAspect="Content" ObjectID="_1833618570" r:id="rId2"/>
+        <o:OLEObject Type="Embed" ProgID="CorelDraw.Graphic.16" ShapeID="_x0000_s2051" DrawAspect="Content" ObjectID="_1834056103" r:id="rId2"/>
       </w:object>
     </w:r>
   </w:p>

</xml_diff>

<commit_message>
refactor: static ttd when e-materai
Co-authored-by: Copilot <copilot@github.com>
</commit_message>
<xml_diff>
--- a/templates/template_invoices_2.docx
+++ b/templates/template_invoices_2.docx
@@ -461,6 +461,364 @@
         </w:rPr>
       </w:pPr>
     </w:p>
+    <w:tbl>
+      <w:tblPr>
+        <w:tblStyle w:val="TableGrid"/>
+        <w:tblW w:w="0" w:type="auto"/>
+        <w:tblBorders>
+          <w:top w:val="none" w:sz="0" w:space="0" w:color="auto"/>
+          <w:left w:val="none" w:sz="0" w:space="0" w:color="auto"/>
+          <w:bottom w:val="none" w:sz="0" w:space="0" w:color="auto"/>
+          <w:right w:val="none" w:sz="0" w:space="0" w:color="auto"/>
+          <w:insideH w:val="none" w:sz="0" w:space="0" w:color="auto"/>
+          <w:insideV w:val="none" w:sz="0" w:space="0" w:color="auto"/>
+        </w:tblBorders>
+        <w:tblLook w:val="04A0" w:firstRow="1" w:lastRow="0" w:firstColumn="1" w:lastColumn="0" w:noHBand="0" w:noVBand="1"/>
+      </w:tblPr>
+      <w:tblGrid>
+        <w:gridCol w:w="2945"/>
+        <w:gridCol w:w="2295"/>
+        <w:gridCol w:w="3596"/>
+      </w:tblGrid>
+      <w:tr>
+        <w:tc>
+          <w:tcPr>
+            <w:tcW w:w="2945" w:type="dxa"/>
+          </w:tcPr>
+          <w:p>
+            <w:pPr>
+              <w:tabs>
+                <w:tab w:val="left" w:pos="2552"/>
+                <w:tab w:val="left" w:pos="5812"/>
+              </w:tabs>
+              <w:rPr>
+                <w:rFonts w:ascii="Times New Roman" w:eastAsia="Times New Roman" w:hAnsi="Times New Roman" w:cs="Times New Roman"/>
+                <w:sz w:val="24"/>
+                <w:szCs w:val="24"/>
+              </w:rPr>
+            </w:pPr>
+          </w:p>
+        </w:tc>
+        <w:tc>
+          <w:tcPr>
+            <w:tcW w:w="2295" w:type="dxa"/>
+          </w:tcPr>
+          <w:p>
+            <w:pPr>
+              <w:tabs>
+                <w:tab w:val="left" w:pos="2552"/>
+                <w:tab w:val="left" w:pos="5812"/>
+              </w:tabs>
+              <w:rPr>
+                <w:rFonts w:ascii="Times New Roman" w:eastAsia="Times New Roman" w:hAnsi="Times New Roman" w:cs="Times New Roman"/>
+                <w:sz w:val="24"/>
+                <w:szCs w:val="24"/>
+              </w:rPr>
+            </w:pPr>
+          </w:p>
+        </w:tc>
+        <w:tc>
+          <w:tcPr>
+            <w:tcW w:w="3596" w:type="dxa"/>
+          </w:tcPr>
+          <w:p>
+            <w:pPr>
+              <w:tabs>
+                <w:tab w:val="left" w:pos="2552"/>
+                <w:tab w:val="left" w:pos="5812"/>
+              </w:tabs>
+              <w:rPr>
+                <w:rFonts w:ascii="Times New Roman" w:eastAsia="Times New Roman" w:hAnsi="Times New Roman" w:cs="Times New Roman"/>
+                <w:sz w:val="24"/>
+                <w:szCs w:val="24"/>
+              </w:rPr>
+            </w:pPr>
+            <w:r>
+              <w:rPr>
+                <w:rFonts w:ascii="Times New Roman" w:eastAsia="Times New Roman" w:hAnsi="Times New Roman" w:cs="Times New Roman"/>
+                <w:sz w:val="24"/>
+                <w:szCs w:val="24"/>
+              </w:rPr>
+              <w:t>Bandung, {today}</w:t>
+            </w:r>
+          </w:p>
+        </w:tc>
+      </w:tr>
+      <w:tr>
+        <w:tc>
+          <w:tcPr>
+            <w:tcW w:w="2945" w:type="dxa"/>
+          </w:tcPr>
+          <w:p>
+            <w:pPr>
+              <w:tabs>
+                <w:tab w:val="left" w:pos="2552"/>
+                <w:tab w:val="left" w:pos="5812"/>
+              </w:tabs>
+              <w:rPr>
+                <w:rFonts w:ascii="Times New Roman" w:eastAsia="Times New Roman" w:hAnsi="Times New Roman" w:cs="Times New Roman"/>
+                <w:sz w:val="24"/>
+                <w:szCs w:val="24"/>
+              </w:rPr>
+            </w:pPr>
+          </w:p>
+        </w:tc>
+        <w:tc>
+          <w:tcPr>
+            <w:tcW w:w="2295" w:type="dxa"/>
+          </w:tcPr>
+          <w:p>
+            <w:pPr>
+              <w:tabs>
+                <w:tab w:val="left" w:pos="2552"/>
+                <w:tab w:val="left" w:pos="5812"/>
+              </w:tabs>
+              <w:rPr>
+                <w:rFonts w:ascii="Times New Roman" w:eastAsia="Times New Roman" w:hAnsi="Times New Roman" w:cs="Times New Roman"/>
+                <w:sz w:val="24"/>
+                <w:szCs w:val="24"/>
+              </w:rPr>
+            </w:pPr>
+          </w:p>
+        </w:tc>
+        <w:tc>
+          <w:tcPr>
+            <w:tcW w:w="3596" w:type="dxa"/>
+          </w:tcPr>
+          <w:p>
+            <w:pPr>
+              <w:tabs>
+                <w:tab w:val="left" w:pos="2552"/>
+                <w:tab w:val="left" w:pos="5812"/>
+              </w:tabs>
+              <w:rPr>
+                <w:rFonts w:ascii="Times New Roman" w:eastAsia="Times New Roman" w:hAnsi="Times New Roman" w:cs="Times New Roman"/>
+                <w:sz w:val="24"/>
+                <w:szCs w:val="24"/>
+              </w:rPr>
+            </w:pPr>
+            <w:r>
+              <w:rPr>
+                <w:rFonts w:ascii="Times New Roman" w:eastAsia="Times New Roman" w:hAnsi="Times New Roman" w:cs="Times New Roman"/>
+                <w:sz w:val="24"/>
+                <w:szCs w:val="24"/>
+              </w:rPr>
+              <w:t>Finance &amp; Administration</w:t>
+            </w:r>
+          </w:p>
+        </w:tc>
+      </w:tr>
+      <w:tr>
+        <w:trPr>
+          <w:trHeight w:val="1723"/>
+        </w:trPr>
+        <w:tc>
+          <w:tcPr>
+            <w:tcW w:w="2945" w:type="dxa"/>
+          </w:tcPr>
+          <w:p>
+            <w:pPr>
+              <w:tabs>
+                <w:tab w:val="left" w:pos="2552"/>
+                <w:tab w:val="left" w:pos="5812"/>
+              </w:tabs>
+              <w:rPr>
+                <w:rFonts w:ascii="Times New Roman" w:eastAsia="Times New Roman" w:hAnsi="Times New Roman" w:cs="Times New Roman"/>
+                <w:sz w:val="24"/>
+                <w:szCs w:val="24"/>
+              </w:rPr>
+            </w:pPr>
+          </w:p>
+        </w:tc>
+        <w:tc>
+          <w:tcPr>
+            <w:tcW w:w="2295" w:type="dxa"/>
+          </w:tcPr>
+          <w:p>
+            <w:pPr>
+              <w:tabs>
+                <w:tab w:val="left" w:pos="2552"/>
+                <w:tab w:val="left" w:pos="5812"/>
+              </w:tabs>
+              <w:rPr>
+                <w:rFonts w:ascii="Times New Roman" w:eastAsia="Times New Roman" w:hAnsi="Times New Roman" w:cs="Times New Roman"/>
+                <w:sz w:val="24"/>
+                <w:szCs w:val="24"/>
+              </w:rPr>
+            </w:pPr>
+          </w:p>
+        </w:tc>
+        <w:tc>
+          <w:tcPr>
+            <w:tcW w:w="3596" w:type="dxa"/>
+            <w:vAlign w:val="center"/>
+          </w:tcPr>
+          <w:p>
+            <w:pPr>
+              <w:tabs>
+                <w:tab w:val="left" w:pos="2552"/>
+                <w:tab w:val="left" w:pos="5812"/>
+              </w:tabs>
+              <w:rPr>
+                <w:rFonts w:ascii="Times New Roman" w:eastAsia="Times New Roman" w:hAnsi="Times New Roman" w:cs="Times New Roman"/>
+                <w:sz w:val="24"/>
+                <w:szCs w:val="24"/>
+              </w:rPr>
+            </w:pPr>
+            <w:r>
+              <w:rPr>
+                <w:rFonts w:ascii="Times New Roman" w:eastAsia="Times New Roman" w:hAnsi="Times New Roman" w:cs="Times New Roman"/>
+                <w:sz w:val="24"/>
+                <w:szCs w:val="24"/>
+              </w:rPr>
+              <w:t>{%</w:t>
+            </w:r>
+            <w:proofErr w:type="spellStart"/>
+            <w:r>
+              <w:rPr>
+                <w:rFonts w:ascii="Times New Roman" w:eastAsia="Times New Roman" w:hAnsi="Times New Roman" w:cs="Times New Roman"/>
+                <w:sz w:val="24"/>
+                <w:szCs w:val="24"/>
+              </w:rPr>
+              <w:t>ttd</w:t>
+            </w:r>
+            <w:proofErr w:type="spellEnd"/>
+            <w:r>
+              <w:rPr>
+                <w:rFonts w:ascii="Times New Roman" w:eastAsia="Times New Roman" w:hAnsi="Times New Roman" w:cs="Times New Roman"/>
+                <w:sz w:val="24"/>
+                <w:szCs w:val="24"/>
+              </w:rPr>
+              <w:t>}</w:t>
+            </w:r>
+          </w:p>
+        </w:tc>
+      </w:tr>
+      <w:tr>
+        <w:tc>
+          <w:tcPr>
+            <w:tcW w:w="2945" w:type="dxa"/>
+          </w:tcPr>
+          <w:p>
+            <w:pPr>
+              <w:tabs>
+                <w:tab w:val="left" w:pos="2552"/>
+                <w:tab w:val="left" w:pos="5812"/>
+              </w:tabs>
+              <w:rPr>
+                <w:rFonts w:ascii="Times New Roman" w:eastAsia="Times New Roman" w:hAnsi="Times New Roman" w:cs="Times New Roman"/>
+                <w:sz w:val="24"/>
+                <w:szCs w:val="24"/>
+              </w:rPr>
+            </w:pPr>
+          </w:p>
+        </w:tc>
+        <w:tc>
+          <w:tcPr>
+            <w:tcW w:w="2295" w:type="dxa"/>
+          </w:tcPr>
+          <w:p>
+            <w:pPr>
+              <w:tabs>
+                <w:tab w:val="left" w:pos="2552"/>
+                <w:tab w:val="left" w:pos="5812"/>
+              </w:tabs>
+              <w:rPr>
+                <w:rFonts w:ascii="Times New Roman" w:eastAsia="Times New Roman" w:hAnsi="Times New Roman" w:cs="Times New Roman"/>
+                <w:sz w:val="24"/>
+                <w:szCs w:val="24"/>
+              </w:rPr>
+            </w:pPr>
+          </w:p>
+        </w:tc>
+        <w:tc>
+          <w:tcPr>
+            <w:tcW w:w="3596" w:type="dxa"/>
+          </w:tcPr>
+          <w:p>
+            <w:pPr>
+              <w:tabs>
+                <w:tab w:val="left" w:pos="2552"/>
+                <w:tab w:val="left" w:pos="5812"/>
+              </w:tabs>
+              <w:rPr>
+                <w:rFonts w:ascii="Times New Roman" w:eastAsia="Times New Roman" w:hAnsi="Times New Roman" w:cs="Times New Roman"/>
+                <w:sz w:val="24"/>
+                <w:szCs w:val="24"/>
+              </w:rPr>
+            </w:pPr>
+            <w:proofErr w:type="spellStart"/>
+            <w:r>
+              <w:rPr>
+                <w:rFonts w:ascii="Times New Roman" w:eastAsia="Times New Roman" w:hAnsi="Times New Roman" w:cs="Times New Roman"/>
+                <w:sz w:val="24"/>
+                <w:szCs w:val="24"/>
+              </w:rPr>
+              <w:t>Wahyuni</w:t>
+            </w:r>
+            <w:proofErr w:type="spellEnd"/>
+            <w:r>
+              <w:rPr>
+                <w:rFonts w:ascii="Times New Roman" w:eastAsia="Times New Roman" w:hAnsi="Times New Roman" w:cs="Times New Roman"/>
+                <w:sz w:val="24"/>
+                <w:szCs w:val="24"/>
+              </w:rPr>
+              <w:t xml:space="preserve"> </w:t>
+            </w:r>
+            <w:proofErr w:type="spellStart"/>
+            <w:r>
+              <w:rPr>
+                <w:rFonts w:ascii="Times New Roman" w:eastAsia="Times New Roman" w:hAnsi="Times New Roman" w:cs="Times New Roman"/>
+                <w:sz w:val="24"/>
+                <w:szCs w:val="24"/>
+              </w:rPr>
+              <w:t>Puspitasari</w:t>
+            </w:r>
+            <w:proofErr w:type="spellEnd"/>
+            <w:r>
+              <w:rPr>
+                <w:rFonts w:ascii="Times New Roman" w:eastAsia="Times New Roman" w:hAnsi="Times New Roman" w:cs="Times New Roman"/>
+                <w:sz w:val="24"/>
+                <w:szCs w:val="24"/>
+              </w:rPr>
+              <w:t xml:space="preserve"> </w:t>
+            </w:r>
+            <w:r>
+              <w:rPr>
+                <w:rFonts w:ascii="Times New Roman" w:eastAsia="Times New Roman" w:hAnsi="Times New Roman" w:cs="Times New Roman"/>
+                <w:i/>
+                <w:iCs/>
+                <w:sz w:val="24"/>
+                <w:szCs w:val="24"/>
+              </w:rPr>
+              <w:t>{</w:t>
+            </w:r>
+            <w:proofErr w:type="spellStart"/>
+            <w:r>
+              <w:rPr>
+                <w:rFonts w:ascii="Times New Roman" w:eastAsia="Times New Roman" w:hAnsi="Times New Roman" w:cs="Times New Roman"/>
+                <w:i/>
+                <w:iCs/>
+                <w:sz w:val="24"/>
+                <w:szCs w:val="24"/>
+              </w:rPr>
+              <w:t>e_materai</w:t>
+            </w:r>
+            <w:proofErr w:type="spellEnd"/>
+            <w:r>
+              <w:rPr>
+                <w:rFonts w:ascii="Times New Roman" w:eastAsia="Times New Roman" w:hAnsi="Times New Roman" w:cs="Times New Roman"/>
+                <w:i/>
+                <w:iCs/>
+                <w:sz w:val="24"/>
+                <w:szCs w:val="24"/>
+              </w:rPr>
+              <w:t>}</w:t>
+            </w:r>
+          </w:p>
+        </w:tc>
+      </w:tr>
+    </w:tbl>
     <w:p>
       <w:pPr>
         <w:tabs>
@@ -470,259 +828,12 @@
         <w:spacing w:after="0"/>
         <w:rPr>
           <w:rFonts w:ascii="Times New Roman" w:eastAsia="Times New Roman" w:hAnsi="Times New Roman" w:cs="Times New Roman"/>
-          <w:sz w:val="24"/>
-          <w:szCs w:val="24"/>
-        </w:rPr>
-      </w:pPr>
-      <w:r>
-        <w:rPr>
-          <w:rFonts w:ascii="Times New Roman" w:eastAsia="Times New Roman" w:hAnsi="Times New Roman" w:cs="Times New Roman"/>
-          <w:sz w:val="24"/>
-          <w:szCs w:val="24"/>
-        </w:rPr>
-        <w:tab/>
-      </w:r>
-      <w:r>
-        <w:rPr>
-          <w:rFonts w:ascii="Times New Roman" w:eastAsia="Times New Roman" w:hAnsi="Times New Roman" w:cs="Times New Roman"/>
-          <w:sz w:val="24"/>
-          <w:szCs w:val="24"/>
-        </w:rPr>
-        <w:tab/>
-        <w:t xml:space="preserve">Bandung, </w:t>
-      </w:r>
-      <w:r>
-        <w:rPr>
-          <w:rFonts w:ascii="Times New Roman" w:eastAsia="Times New Roman" w:hAnsi="Times New Roman" w:cs="Times New Roman"/>
-          <w:sz w:val="24"/>
-          <w:szCs w:val="24"/>
-        </w:rPr>
-        <w:t>{today}</w:t>
-      </w:r>
-    </w:p>
-    <w:p>
-      <w:pPr>
-        <w:tabs>
-          <w:tab w:val="left" w:pos="2552"/>
-          <w:tab w:val="left" w:pos="5387"/>
-        </w:tabs>
-        <w:spacing w:after="0"/>
-        <w:rPr>
-          <w:rFonts w:ascii="Times New Roman" w:eastAsia="Times New Roman" w:hAnsi="Times New Roman" w:cs="Times New Roman"/>
-          <w:sz w:val="24"/>
-          <w:szCs w:val="24"/>
-        </w:rPr>
-      </w:pPr>
-      <w:r>
-        <w:rPr>
-          <w:rFonts w:ascii="Times New Roman" w:eastAsia="Times New Roman" w:hAnsi="Times New Roman" w:cs="Times New Roman"/>
-          <w:sz w:val="24"/>
-          <w:szCs w:val="24"/>
-        </w:rPr>
-        <w:tab/>
-      </w:r>
-      <w:r>
-        <w:rPr>
-          <w:rFonts w:ascii="Times New Roman" w:eastAsia="Times New Roman" w:hAnsi="Times New Roman" w:cs="Times New Roman"/>
-          <w:sz w:val="24"/>
-          <w:szCs w:val="24"/>
-        </w:rPr>
-        <w:tab/>
-      </w:r>
-      <w:r>
-        <w:rPr>
-          <w:rFonts w:ascii="Times New Roman" w:eastAsia="Times New Roman" w:hAnsi="Times New Roman" w:cs="Times New Roman"/>
-          <w:sz w:val="24"/>
-          <w:szCs w:val="24"/>
-        </w:rPr>
-        <w:t>Finance</w:t>
-      </w:r>
-      <w:r>
-        <w:rPr>
-          <w:rFonts w:ascii="Times New Roman" w:eastAsia="Times New Roman" w:hAnsi="Times New Roman" w:cs="Times New Roman"/>
-          <w:sz w:val="24"/>
-          <w:szCs w:val="24"/>
-        </w:rPr>
-        <w:t xml:space="preserve"> &amp; </w:t>
-      </w:r>
-      <w:r>
-        <w:rPr>
-          <w:rFonts w:ascii="Times New Roman" w:eastAsia="Times New Roman" w:hAnsi="Times New Roman" w:cs="Times New Roman"/>
-          <w:sz w:val="24"/>
-          <w:szCs w:val="24"/>
-        </w:rPr>
-        <w:t>Administration</w:t>
-      </w:r>
-    </w:p>
-    <w:p>
-      <w:pPr>
-        <w:tabs>
-          <w:tab w:val="left" w:pos="2552"/>
-          <w:tab w:val="left" w:pos="5812"/>
-        </w:tabs>
-        <w:spacing w:after="0"/>
-        <w:rPr>
-          <w:rFonts w:ascii="Times New Roman" w:eastAsia="Times New Roman" w:hAnsi="Times New Roman" w:cs="Times New Roman"/>
-          <w:sz w:val="24"/>
-          <w:szCs w:val="24"/>
-        </w:rPr>
-      </w:pPr>
-    </w:p>
-    <w:p>
-      <w:pPr>
-        <w:tabs>
-          <w:tab w:val="left" w:pos="2552"/>
-          <w:tab w:val="left" w:pos="5812"/>
-        </w:tabs>
-        <w:spacing w:after="0"/>
-        <w:rPr>
-          <w:rFonts w:ascii="Times New Roman" w:eastAsia="Times New Roman" w:hAnsi="Times New Roman" w:cs="Times New Roman"/>
-          <w:sz w:val="24"/>
-          <w:szCs w:val="24"/>
-        </w:rPr>
-      </w:pPr>
-      <w:r>
-        <w:rPr>
-          <w:rFonts w:ascii="Times New Roman" w:eastAsia="Times New Roman" w:hAnsi="Times New Roman" w:cs="Times New Roman"/>
-          <w:sz w:val="24"/>
-          <w:szCs w:val="24"/>
-        </w:rPr>
-        <w:tab/>
-      </w:r>
-      <w:r>
-        <w:rPr>
-          <w:rFonts w:ascii="Times New Roman" w:eastAsia="Times New Roman" w:hAnsi="Times New Roman" w:cs="Times New Roman"/>
-          <w:sz w:val="24"/>
-          <w:szCs w:val="24"/>
-        </w:rPr>
-        <w:tab/>
-      </w:r>
-    </w:p>
-    <w:p>
-      <w:pPr>
-        <w:tabs>
-          <w:tab w:val="left" w:pos="2552"/>
-          <w:tab w:val="left" w:pos="5812"/>
-        </w:tabs>
-        <w:spacing w:after="0"/>
-        <w:rPr>
-          <w:rFonts w:ascii="Times New Roman" w:eastAsia="Times New Roman" w:hAnsi="Times New Roman" w:cs="Times New Roman"/>
-          <w:sz w:val="24"/>
-          <w:szCs w:val="24"/>
-        </w:rPr>
-      </w:pPr>
-    </w:p>
-    <w:p>
-      <w:pPr>
-        <w:tabs>
-          <w:tab w:val="left" w:pos="2552"/>
-          <w:tab w:val="left" w:pos="5812"/>
-        </w:tabs>
-        <w:rPr>
-          <w:rFonts w:ascii="Times New Roman" w:eastAsia="Times New Roman" w:hAnsi="Times New Roman" w:cs="Times New Roman"/>
-          <w:sz w:val="24"/>
-          <w:szCs w:val="24"/>
-        </w:rPr>
-      </w:pPr>
-    </w:p>
-    <w:p>
-      <w:pPr>
-        <w:tabs>
-          <w:tab w:val="left" w:pos="2552"/>
-          <w:tab w:val="left" w:pos="5387"/>
-        </w:tabs>
-        <w:rPr>
-          <w:rFonts w:ascii="Times New Roman" w:eastAsia="Times New Roman" w:hAnsi="Times New Roman" w:cs="Times New Roman"/>
           <w:i/>
           <w:iCs/>
           <w:sz w:val="24"/>
           <w:szCs w:val="24"/>
         </w:rPr>
       </w:pPr>
-      <w:r>
-        <w:rPr>
-          <w:rFonts w:ascii="Times New Roman" w:eastAsia="Times New Roman" w:hAnsi="Times New Roman" w:cs="Times New Roman"/>
-          <w:sz w:val="24"/>
-          <w:szCs w:val="24"/>
-        </w:rPr>
-        <w:tab/>
-      </w:r>
-      <w:r>
-        <w:rPr>
-          <w:rFonts w:ascii="Times New Roman" w:eastAsia="Times New Roman" w:hAnsi="Times New Roman" w:cs="Times New Roman"/>
-          <w:sz w:val="24"/>
-          <w:szCs w:val="24"/>
-        </w:rPr>
-        <w:tab/>
-      </w:r>
-      <w:proofErr w:type="spellStart"/>
-      <w:r>
-        <w:rPr>
-          <w:rFonts w:ascii="Times New Roman" w:eastAsia="Times New Roman" w:hAnsi="Times New Roman" w:cs="Times New Roman"/>
-          <w:sz w:val="24"/>
-          <w:szCs w:val="24"/>
-        </w:rPr>
-        <w:t>Wahyuni</w:t>
-      </w:r>
-      <w:proofErr w:type="spellEnd"/>
-      <w:r>
-        <w:rPr>
-          <w:rFonts w:ascii="Times New Roman" w:eastAsia="Times New Roman" w:hAnsi="Times New Roman" w:cs="Times New Roman"/>
-          <w:sz w:val="24"/>
-          <w:szCs w:val="24"/>
-        </w:rPr>
-        <w:t xml:space="preserve"> </w:t>
-      </w:r>
-      <w:proofErr w:type="spellStart"/>
-      <w:r>
-        <w:rPr>
-          <w:rFonts w:ascii="Times New Roman" w:eastAsia="Times New Roman" w:hAnsi="Times New Roman" w:cs="Times New Roman"/>
-          <w:sz w:val="24"/>
-          <w:szCs w:val="24"/>
-        </w:rPr>
-        <w:t>Puspitasari</w:t>
-      </w:r>
-      <w:proofErr w:type="spellEnd"/>
-      <w:r>
-        <w:rPr>
-          <w:rFonts w:ascii="Times New Roman" w:eastAsia="Times New Roman" w:hAnsi="Times New Roman" w:cs="Times New Roman"/>
-          <w:sz w:val="24"/>
-          <w:szCs w:val="24"/>
-        </w:rPr>
-        <w:t xml:space="preserve"> </w:t>
-      </w:r>
-      <w:r>
-        <w:rPr>
-          <w:rFonts w:ascii="Times New Roman" w:eastAsia="Times New Roman" w:hAnsi="Times New Roman" w:cs="Times New Roman"/>
-          <w:i/>
-          <w:iCs/>
-          <w:sz w:val="24"/>
-          <w:szCs w:val="24"/>
-        </w:rPr>
-        <w:t>{</w:t>
-      </w:r>
-      <w:proofErr w:type="spellStart"/>
-      <w:r>
-        <w:rPr>
-          <w:rFonts w:ascii="Times New Roman" w:eastAsia="Times New Roman" w:hAnsi="Times New Roman" w:cs="Times New Roman"/>
-          <w:i/>
-          <w:iCs/>
-          <w:sz w:val="24"/>
-          <w:szCs w:val="24"/>
-        </w:rPr>
-        <w:t>e_materai</w:t>
-      </w:r>
-      <w:proofErr w:type="spellEnd"/>
-      <w:r>
-        <w:rPr>
-          <w:rFonts w:ascii="Times New Roman" w:eastAsia="Times New Roman" w:hAnsi="Times New Roman" w:cs="Times New Roman"/>
-          <w:i/>
-          <w:iCs/>
-          <w:sz w:val="24"/>
-          <w:szCs w:val="24"/>
-        </w:rPr>
-        <w:t>}</w:t>
-      </w:r>
     </w:p>
     <w:p>
       <w:pPr>
@@ -2290,8 +2401,8 @@
       </w:pPr>
     </w:p>
     <w:sectPr>
-      <w:headerReference w:type="default" r:id="rId7"/>
-      <w:footerReference w:type="default" r:id="rId8"/>
+      <w:headerReference w:type="default" r:id="rId8"/>
+      <w:footerReference w:type="default" r:id="rId9"/>
       <w:pgSz w:w="11906" w:h="16838"/>
       <w:pgMar w:top="1814" w:right="1440" w:bottom="1440" w:left="1620" w:header="708" w:footer="1591" w:gutter="0"/>
       <w:pgNumType w:start="1"/>
@@ -2376,7 +2487,7 @@
         <v:shape id="_x0000_i1026" type="#_x0000_t75" style="width:453.75pt;height:7.5pt">
           <v:imagedata r:id="rId1" o:title=""/>
         </v:shape>
-        <o:OLEObject Type="Embed" ProgID="CorelDraw.Graphic.16" ShapeID="_x0000_i1026" DrawAspect="Content" ObjectID="_1834057100" r:id="rId2"/>
+        <o:OLEObject Type="Embed" ProgID="CorelDraw.Graphic.16" ShapeID="_x0000_i1026" DrawAspect="Content" ObjectID="_1839480604" r:id="rId2"/>
       </w:object>
     </w:r>
     <w:r>
@@ -2655,7 +2766,7 @@
           <v:imagedata r:id="rId1" o:title=""/>
           <w10:wrap anchorx="margin"/>
         </v:shape>
-        <o:OLEObject Type="Embed" ProgID="CorelDraw.Graphic.16" ShapeID="_x0000_s2051" DrawAspect="Content" ObjectID="_1834057101" r:id="rId2"/>
+        <o:OLEObject Type="Embed" ProgID="CorelDraw.Graphic.16" ShapeID="_x0000_s2051" DrawAspect="Content" ObjectID="_1839480605" r:id="rId2"/>
       </w:object>
     </w:r>
   </w:p>
@@ -3922,6 +4033,10 @@
 </go:gDocsCustomXmlDataStorage>
 </file>
 
+<file path=customXml/item2.xml><?xml version="1.0" encoding="utf-8"?>
+<b:Sources xmlns:b="http://schemas.openxmlformats.org/officeDocument/2006/bibliography" xmlns="http://schemas.openxmlformats.org/officeDocument/2006/bibliography" SelectedStyle="\APASixthEditionOfficeOnline.xsl" StyleName="APA" Version="6"/>
+</file>
+
 <file path=customXml/itemProps1.xml><?xml version="1.0" encoding="utf-8"?>
 <ds:datastoreItem xmlns:ds="http://schemas.openxmlformats.org/officeDocument/2006/customXml" ds:itemID="{11111111-1234-1234-1234-123412341234}">
   <ds:schemaRefs>
@@ -3929,4 +4044,12 @@
     <ds:schemaRef ds:uri="http://schemas.openxmlformats.org/officeDocument/2006/relationships"/>
   </ds:schemaRefs>
 </ds:datastoreItem>
+</file>
+
+<file path=customXml/itemProps2.xml><?xml version="1.0" encoding="utf-8"?>
+<ds:datastoreItem xmlns:ds="http://schemas.openxmlformats.org/officeDocument/2006/customXml" ds:itemID="{7226EF42-1DDD-4813-98C1-4D3622CC86E5}">
+  <ds:schemaRefs>
+    <ds:schemaRef ds:uri="http://schemas.openxmlformats.org/officeDocument/2006/bibliography"/>
+  </ds:schemaRefs>
+</ds:datastoreItem>
 </file>
</xml_diff>